<commit_message>
feat(core): config & llm clients & agent state
- pydantic-settings based config with SecretStr for API keys
- typed AgentState with all-phase fields defined upfront
- LLM client factories for DeepSeek chat/reasoner + Aliyun embedding
- Pydantic entities: KnowledgeChunk / ScoreResult / API I/O
- update spec docx to reflect actual vendor choices
- add /config endpoint for env verification
</commit_message>
<xml_diff>
--- a/PetroChat-Agent项目结构说明书-Python版.docx
+++ b/PetroChat-Agent项目结构说明书-Python版.docx
@@ -3420,7 +3420,7 @@
                 <w:sz w:val="18"/>
                 <w:szCs w:val="18"/>
               </w:rPr>
-              <w:t xml:space="preserve">Chroma（起步）/ PGVector（进阶）</w:t>
+              <w:t>Chroma（HTTP 服务，Docker 部署）/ PGVector（进阶）</w:t>
             </w:r>
           </w:p>
         </w:tc>
@@ -3451,7 +3451,7 @@
                 <w:sz w:val="18"/>
                 <w:szCs w:val="18"/>
               </w:rPr>
-              <w:t xml:space="preserve">Chroma 零配置易上手；PGVector 适合与业务库统一管理。</w:t>
+              <w:t>Chroma 起服务避免 Windows 下 hnswlib 编译依赖；Python 端用 chromadb-client 直连，不引入 langchain-chroma 黑盒封装，便于学习向量库的原子操作（创建/批量入库/元数据过滤/检索/删除）。</w:t>
             </w:r>
           </w:p>
         </w:tc>
@@ -3515,7 +3515,7 @@
                 <w:sz w:val="18"/>
                 <w:szCs w:val="18"/>
               </w:rPr>
-              <w:t xml:space="preserve">通义千问 / DeepSeek API</w:t>
+              <w:t>DeepSeek（chat + reasoner，OpenAI 兼容协议）</w:t>
             </w:r>
           </w:p>
         </w:tc>
@@ -3545,7 +3545,7 @@
                 <w:sz w:val="18"/>
                 <w:szCs w:val="18"/>
               </w:rPr>
-              <w:t xml:space="preserve">国内可直接调用，中文能力强，成本低。</w:t>
+              <w:t>deepseek-chat 用于 RAG 问答生成；deepseek-reasoner 后续用于三维质检评分，推理能力适合复杂 judge 任务；OpenAI 兼容协议可与 langchain-openai 直接对接。</w:t>
             </w:r>
           </w:p>
         </w:tc>
@@ -3611,7 +3611,7 @@
                 <w:sz w:val="18"/>
                 <w:szCs w:val="18"/>
               </w:rPr>
-              <w:t xml:space="preserve">BGE / 通义 text-embedding</w:t>
+              <w:t>阿里云百炼 text-embedding-v3（1024 维）</w:t>
             </w:r>
           </w:p>
         </w:tc>
@@ -3642,7 +3642,7 @@
                 <w:sz w:val="18"/>
                 <w:szCs w:val="18"/>
               </w:rPr>
-              <w:t xml:space="preserve">中文向量化效果好，可本地部署或调 API。</w:t>
+              <w:t>国内中文 embedding 标杆，支持 8K 长上下文（标准规范条款较长更友好），可变维度（512/768/1024/1536/2048），通过 OpenAI 兼容协议调用。</w:t>
             </w:r>
           </w:p>
         </w:tc>
@@ -4193,7 +4193,7 @@
         <w:spacing w:after="60" w:line="290"/>
       </w:pPr>
       <w:r>
-        <w:t xml:space="preserve">数据库：PostgreSQL 16 + pgvector 扩展；起步阶段可先用 Chroma 本地向量库。</w:t>
+        <w:t>数据库：起步阶段 Chroma 由 docker-compose 拉起（chromadb/chroma 镜像，HTTP 服务模式），Python 端用 chromadb-client 连接，不需要本地 MSVC 编译；进阶阶段迁 PostgreSQL 16 + pgvector 扩展。</w:t>
       </w:r>
     </w:p>
     <w:p>
@@ -10338,7 +10338,7 @@
         <w:spacing w:after="60" w:line="290"/>
       </w:pPr>
       <w:r>
-        <w:t xml:space="preserve">接入向量数据库（起步用 Chroma，零配置）。</w:t>
+        <w:t>接入向量数据库（起步用 Chroma HTTP 服务，由 docker compose up -d chroma 启动；Python 端用 chromadb-client 直连）。</w:t>
       </w:r>
     </w:p>
     <w:p>

</xml_diff>

<commit_message>
chore(phase-4.8): 收官 v1.0 multiagent
</commit_message>
<xml_diff>
--- a/PetroChat-Agent项目结构说明书-Python版.docx
+++ b/PetroChat-Agent项目结构说明书-Python版.docx
@@ -101,12 +101,7 @@
         <w:jc w:val="center"/>
       </w:pPr>
       <w:r>
-        <w:rPr>
-          <w:color w:val="444441"/>
-          <w:sz w:val="22"/>
-          <w:szCs w:val="22"/>
-        </w:rPr>
-        <w:t xml:space="preserve">文档版本 v2.0</w:t>
+        <w:t>文档版本 v2.1（v1.0-multiagent 收官版）</w:t>
       </w:r>
     </w:p>
     <w:p>
@@ -10957,6 +10952,206 @@
           <w:szCs w:val="20"/>
         </w:rPr>
         <w:t xml:space="preserve">— 文档结束 —</w:t>
+      </w:r>
+    </w:p>
+    <w:p>
+      <w:r>
+        <w:br w:type="page"/>
+      </w:r>
+    </w:p>
+    <w:p>
+      <w:r>
+        <w:rPr>
+          <w:b/>
+          <w:sz w:val="32"/>
+        </w:rPr>
+        <w:t>10. v1.0-multiagent 收官记录</w:t>
+      </w:r>
+    </w:p>
+    <w:p>
+      <w:r>
+        <w:t>本节记录第四阶段收官后的实际工程状态。项目原规划中的“多 Agent 协作”目标已落地为 Supervisor 路由 + RAG 问答 + NL2SQL 数据查询 + 报表侧信道输出；三维质检评分作为后续可选增强保留，不再作为 v1.0 的收官阻塞项。</w:t>
+      </w:r>
+    </w:p>
+    <w:p>
+      <w:r>
+        <w:rPr>
+          <w:b/>
+          <w:sz w:val="26"/>
+        </w:rPr>
+        <w:t>10.1 阶段完成情况</w:t>
+      </w:r>
+    </w:p>
+    <w:p>
+      <w:pPr>
+        <w:ind w:left="280"/>
+      </w:pPr>
+      <w:r>
+        <w:rPr>
+          <w:sz w:val="21"/>
+        </w:rPr>
+        <w:t>[x] Phase 1 RAG 问答：完成文档解析、Chroma 入库、Retriever、LangGraph 单节点和 FastAPI SSE。</w:t>
+      </w:r>
+    </w:p>
+    <w:p>
+      <w:pPr>
+        <w:ind w:left="280"/>
+      </w:pPr>
+      <w:r>
+        <w:rPr>
+          <w:sz w:val="21"/>
+        </w:rPr>
+        <w:t>[x] Phase 2 Tool Calling：完成单位换算、条款精查、限定文档检索、跨文档检索，并接入 ReAct 工具循环。</w:t>
+      </w:r>
+    </w:p>
+    <w:p>
+      <w:pPr>
+        <w:ind w:left="280"/>
+      </w:pPr>
+      <w:r>
+        <w:rPr>
+          <w:sz w:val="21"/>
+        </w:rPr>
+        <w:t>[x] Phase 3 MCP Server：完成 FastMCP Server、stdio/streamable-http 双传输，以及 LangChain 工具桥接。</w:t>
+      </w:r>
+    </w:p>
+    <w:p>
+      <w:pPr>
+        <w:ind w:left="280"/>
+      </w:pPr>
+      <w:r>
+        <w:rPr>
+          <w:sz w:val="21"/>
+        </w:rPr>
+        <w:t>[x] Phase 4 多 Agent 数据问答：完成 MySQL 只读查询、NL2SQL、报表模块和 Supervisor 三路子 agent。</w:t>
+      </w:r>
+    </w:p>
+    <w:p>
+      <w:r>
+        <w:rPr>
+          <w:b/>
+          <w:sz w:val="26"/>
+        </w:rPr>
+        <w:t>10.2 Phase 4 关键产出</w:t>
+      </w:r>
+    </w:p>
+    <w:p>
+      <w:pPr>
+        <w:ind w:left="280"/>
+      </w:pPr>
+      <w:r>
+        <w:rPr>
+          <w:sz w:val="21"/>
+        </w:rPr>
+        <w:t>[x] DB 基础设施：SQLAlchemy 引擎、健康检查、表白名单、schema dump、枚举值采样。</w:t>
+      </w:r>
+    </w:p>
+    <w:p>
+      <w:pPr>
+        <w:ind w:left="280"/>
+      </w:pPr>
+      <w:r>
+        <w:rPr>
+          <w:sz w:val="21"/>
+        </w:rPr>
+        <w:t>[x] NL2SQL 链路：DeepSeek function calling 生成 SQL，sqlglot AST 校验，只允许单条 SELECT。</w:t>
+      </w:r>
+    </w:p>
+    <w:p>
+      <w:pPr>
+        <w:ind w:left="280"/>
+      </w:pPr>
+      <w:r>
+        <w:rPr>
+          <w:sz w:val="21"/>
+        </w:rPr>
+        <w:t>[x] 执行安全：只读账号建议、会话只读保护、LIMIT 注入、MySQL MAX_EXECUTION_TIME 超时。</w:t>
+      </w:r>
+    </w:p>
+    <w:p>
+      <w:pPr>
+        <w:ind w:left="280"/>
+      </w:pPr>
+      <w:r>
+        <w:rPr>
+          <w:sz w:val="21"/>
+        </w:rPr>
+        <w:t>[x] 报表输出：DataFrame 转 Markdown，自动生成 base64 PNG 图表，通过 SSE meta 事件传给前端。</w:t>
+      </w:r>
+    </w:p>
+    <w:p>
+      <w:pPr>
+        <w:ind w:left="280"/>
+      </w:pPr>
+      <w:r>
+        <w:rPr>
+          <w:sz w:val="21"/>
+        </w:rPr>
+        <w:t>[x] Supervisor 重构：supervisor、qa、sql、general、tools 五节点图已取代旧 agent_node。</w:t>
+      </w:r>
+    </w:p>
+    <w:p>
+      <w:pPr>
+        <w:ind w:left="280"/>
+      </w:pPr>
+      <w:r>
+        <w:rPr>
+          <w:sz w:val="21"/>
+        </w:rPr>
+        <w:t>[x] 测试验证：当前 pytest 全量通过，覆盖核心离线逻辑和外部依赖探活。</w:t>
+      </w:r>
+    </w:p>
+    <w:p>
+      <w:r>
+        <w:rPr>
+          <w:b/>
+          <w:sz w:val="26"/>
+        </w:rPr>
+        <w:t>10.3 当前边界与后续增强</w:t>
+      </w:r>
+    </w:p>
+    <w:p>
+      <w:pPr>
+        <w:ind w:left="280"/>
+      </w:pPr>
+      <w:r>
+        <w:rPr>
+          <w:sz w:val="21"/>
+        </w:rPr>
+        <w:t>Schema 入向量库暂不实现：当前只给 LLM 白名单表 schema，规模小且 prompt 可控。</w:t>
+      </w:r>
+    </w:p>
+    <w:p>
+      <w:pPr>
+        <w:ind w:left="280"/>
+      </w:pPr>
+      <w:r>
+        <w:rPr>
+          <w:sz w:val="21"/>
+        </w:rPr>
+        <w:t>三维质检评分暂缓：项目第二轮目标已转向 NL2SQL + 报表，多 Agent 主线已完成。</w:t>
+      </w:r>
+    </w:p>
+    <w:p>
+      <w:pPr>
+        <w:ind w:left="280"/>
+      </w:pPr>
+      <w:r>
+        <w:rPr>
+          <w:sz w:val="21"/>
+        </w:rPr>
+        <w:t>多用户并发可继续增强：报表侧信道后续可从模块级缓存迁移到 contextvars。</w:t>
+      </w:r>
+    </w:p>
+    <w:p>
+      <w:pPr>
+        <w:ind w:left="280"/>
+      </w:pPr>
+      <w:r>
+        <w:rPr>
+          <w:sz w:val="21"/>
+        </w:rPr>
+        <w:t>前端可独立推进：Vue3 对话窗口消费 token/tool/meta/done 事件即可展示完整演示。</w:t>
       </w:r>
     </w:p>
     <w:sectPr>

</xml_diff>